<commit_message>
chore: add surveyid and remove bugs related to card highlighting and end survey text
</commit_message>
<xml_diff>
--- a/supportdocs/knowledge_test.docx
+++ b/supportdocs/knowledge_test.docx
@@ -4,38 +4,10 @@
   <w:body>
     <w:p>
       <w:pPr>
-        <w:pStyle w:val="Title"/>
-      </w:pPr>
-      <w:r>
-        <w:t>MVC Arena – Study Questionnaire</w:t>
-      </w:r>
-    </w:p>
-    <w:p>
-      <w:pPr>
-        <w:spacing w:after="60"/>
-      </w:pPr>
-    </w:p>
-    <w:p>
-      <w:pPr>
-        <w:spacing w:after="60"/>
-        <w:ind w:left="720"/>
-      </w:pPr>
-    </w:p>
-    <w:p>
-      <w:pPr>
-        <w:pStyle w:val="Heading1"/>
-      </w:pPr>
-      <w:r>
-        <w:t>Part 2 – Quantitative Knowledge Test</w:t>
-      </w:r>
-    </w:p>
-    <w:p>
-      <w:pPr>
         <w:pStyle w:val="Heading2"/>
         <w:pageBreakBefore/>
       </w:pPr>
       <w:r>
-        <w:lastRenderedPageBreak/>
         <w:t>SET A</w:t>
       </w:r>
     </w:p>
@@ -2656,42 +2628,6 @@
         <w:spacing w:after="40"/>
         <w:ind w:left="720"/>
       </w:pPr>
-    </w:p>
-    <w:p>
-      <w:pPr>
-        <w:spacing w:after="40"/>
-        <w:ind w:left="720"/>
-      </w:pPr>
-      <w:r>
-        <w:t>Answer Keys</w:t>
-      </w:r>
-    </w:p>
-    <w:p>
-      <w:pPr>
-        <w:spacing w:after="40"/>
-        <w:ind w:left="720"/>
-      </w:pPr>
-      <w:r>
-        <w:t>Set A: 1-b, 2-c, 3-a, 4-d, 5-a, 6-c, 7-b, 8-d, 9-c, 10-a, 11-b, 12-d, 13-a, 14-c, 15-b, 16-d, 17-c, 18-a, 19-d, 20-b</w:t>
-      </w:r>
-    </w:p>
-    <w:p>
-      <w:pPr>
-        <w:spacing w:after="40"/>
-        <w:ind w:left="720"/>
-      </w:pPr>
-      <w:r>
-        <w:t>Set B: 1-c, 2-a, 3-d, 4-b, 5-d, 6-a, 7-c, 8-b, 9-d, 10-c, 11-a, 12-b, 13-c, 14-a, 15-d, 16-b, 17-a, 18-c, 19-b, 20-d</w:t>
-      </w:r>
-    </w:p>
-    <w:p>
-      <w:pPr>
-        <w:spacing w:after="40"/>
-        <w:ind w:left="720"/>
-      </w:pPr>
-      <w:r>
-        <w:t>Set C: 1-d, 2-b, 3-c, 4-a, 5-b, 6-d, 7-a, 8-c, 9-b, 10-d, 11-c, 12-a, 13-b, 14-d, 15-a, 16-c, 17-b, 18-d, 19-c, 20-a</w:t>
-      </w:r>
     </w:p>
     <w:p>
       <w:pPr>

</xml_diff>